<commit_message>
v1.3.1 — crawler fix, visited hash O(1), session scan_id, Windows GUI improvements
</commit_message>
<xml_diff>
--- a/docs/scanxss_documentation.docx
+++ b/docs/scanxss_documentation.docx
@@ -1094,7 +1094,7 @@
                 <w:sz w:val="20"/>
                 <w:szCs w:val="20"/>
               </w:rPr>
-              <w:t xml:space="preserve">HTML (інтерактивний + OWASP/CWE), JSON, TXT</w:t>
+              <w:t xml:space="preserve">HTML (інтерактивний + OWASP/CWE), TXT</w:t>
             </w:r>
           </w:p>
         </w:tc>
@@ -1158,7 +1158,7 @@
                 <w:sz w:val="20"/>
                 <w:szCs w:val="20"/>
               </w:rPr>
-              <w:t xml:space="preserve">Нативний bundle, ~/.scanxss/, авто-відкриття браузера</w:t>
+              <w:t xml:space="preserve">Нативний bundle, ~/Desktop/report/, авто-відкриття браузера</w:t>
             </w:r>
           </w:p>
         </w:tc>
@@ -2313,7 +2313,7 @@
                 <w:sz w:val="20"/>
                 <w:szCs w:val="20"/>
               </w:rPr>
-              <w:t xml:space="preserve">HTML+CSS+JS / JSON / TXT</w:t>
+              <w:t xml:space="preserve">HTML+CSS+JS / TXT</w:t>
             </w:r>
           </w:p>
         </w:tc>
@@ -7313,7 +7313,7 @@
                 <w:sz w:val="20"/>
                 <w:szCs w:val="20"/>
               </w:rPr>
-              <w:t xml:space="preserve">~/.scanxss/report/&lt;host&gt;/</w:t>
+              <w:t xml:space="preserve">~/Desktop/report/&lt;host&gt;/</w:t>
             </w:r>
           </w:p>
         </w:tc>
@@ -8723,7 +8723,7 @@
                 <w:sz w:val="20"/>
                 <w:szCs w:val="20"/>
               </w:rPr>
-              <w:t xml:space="preserve">~/.scanxss/report/&lt;host&gt;/</w:t>
+              <w:t xml:space="preserve">~/Desktop/report/&lt;host&gt;/</w:t>
             </w:r>
           </w:p>
         </w:tc>
@@ -9562,7 +9562,7 @@
                 <w:sz w:val="20"/>
                 <w:szCs w:val="20"/>
               </w:rPr>
-              <w:t xml:space="preserve">root_bsd (mglushak@gmail.com)</w:t>
+              <w:t xml:space="preserve">root_bsd  root_bsd@itprof.net.ua</w:t>
             </w:r>
           </w:p>
         </w:tc>
@@ -10594,6 +10594,20 @@
           <w:szCs w:val="22"/>
         </w:rPr>
         <w:t xml:space="preserve">Попередня версія (1.3.0) використовувала XOR-шифрування з ключем залежним від GetModuleHandle() (ASLR). Через зміну базової адреси при кожному запуску payload-и розшифровувались неправильно — це була головна причина того, що вразливості не виявлялись. Виправлено в v1.3.1.</w:t>
+      </w:r>
+    </w:p>
+    <w:p>
+      <w:pPr>
+        <w:spacing w:after="120" w:before="60"/>
+      </w:pPr>
+      <w:r>
+        <w:rPr>
+          <w:rFonts w:ascii="Arial" w:cs="Arial" w:eastAsia="Arial" w:hAnsi="Arial"/>
+          <w:color w:val="1E293B"/>
+          <w:sz w:val="22"/>
+          <w:szCs w:val="22"/>
+        </w:rPr>
+        <w:t xml:space="preserve">Також виправлено crawler для Windows: link extraction тепер працює для non-HTML відповідей (JS/CSS/API), .php файли не пропускаються. Звіти macOS збережено в ~/Desktop/report/. JSON формат звітів видалено — доступні HTML та TXT.</w:t>
       </w:r>
     </w:p>
     <w:p>

</xml_diff>